<commit_message>
docs: atualiza guia de deploy e preço premium para R$29,90
- deploy-producao.md e .docx reescritos com estrutura mais clara:
  4 serviços a contratar, o que NÃO contratar, projeção financeira
  com novo preço
- Plano mensal: R$19,90 → R$29,90
- Plano anual: R$159 → R$239 (~R$19,92/mês, 33% de desconto)
- Break-even calculado: 8 assinantes cobrem o custo fixo mensal
- index.html: preços atualizados no paywall e nos cards de plano

Co-Authored-By: Claude Sonnet 4.6 <noreply@anthropic.com>
</commit_message>
<xml_diff>
--- a/docs/deploy-producao.docx
+++ b/docs/deploy-producao.docx
@@ -54,12 +54,21 @@
           <w:color w:val="1A5676"/>
           <w:sz w:val="28"/>
         </w:rPr>
-        <w:t>Arquitetura recomendada</w:t>
+        <w:t>Arquitetura em produção</w:t>
       </w:r>
     </w:p>
     <w:p>
       <w:r>
-        <w:t>O Estuda.AI é uma SPA single-file (index.html). A arquitetura ideal para produção com custo mínimo é:</w:t>
+        <w:t xml:space="preserve">O Estuda.AI é uma SPA single-file (index.html). O frontend </w:t>
+      </w:r>
+      <w:r>
+        <w:rPr>
+          <w:b/>
+        </w:rPr>
+        <w:t>não precisa de servidor pago</w:t>
+      </w:r>
+      <w:r>
+        <w:t xml:space="preserve"> — fica no GitHub Pages gratuitamente. Todo o lado servidor é coberto pelo Supabase via Edge Functions.</w:t>
       </w:r>
     </w:p>
     <w:p>
@@ -76,25 +85,25 @@
         <w:br/>
         <w:t xml:space="preserve">    ↓ HTTPS</w:t>
         <w:br/>
-        <w:t>[GitHub Pages / Vercel / Cloudflare Pages]  ← frontend estático (GRÁTIS)</w:t>
+        <w:t>[GitHub Pages]  ←  frontend estático (GRÁTIS, sem necessidade de VPS)</w:t>
         <w:br/>
         <w:t xml:space="preserve">    ↓ fetch</w:t>
         <w:br/>
-        <w:t>[Supabase]  ← auth + banco PostgreSQL + Edge Functions</w:t>
+        <w:t>[Supabase]  ←  auth + banco PostgreSQL + Edge Functions (o "servidor" real)</w:t>
         <w:br/>
-        <w:t xml:space="preserve">    ├── auth.supabase.co         → login/sessão</w:t>
+        <w:t xml:space="preserve">    ├── auth            → login e sessão dos usuários</w:t>
         <w:br/>
-        <w:t xml:space="preserve">    ├── db.supabase.co           → materias, stats, historico, preferencias</w:t>
+        <w:t xml:space="preserve">    ├── banco           → materias, stats, historico, preferencias</w:t>
         <w:br/>
-        <w:t xml:space="preserve">    ├── Edge Function: stripe-webhook  → recebe eventos do Stripe</w:t>
+        <w:t xml:space="preserve">    ├── Edge Function: stripe-webhook   → processa eventos de pagamento</w:t>
         <w:br/>
-        <w:t xml:space="preserve">    └── Edge Function: anthropic-proxy → proxeia chamadas à Claude API</w:t>
+        <w:t xml:space="preserve">    └── Edge Function: anthropic-proxy → chama a Claude API com chave da plataforma</w:t>
         <w:br/>
-        <w:t xml:space="preserve">    ↓</w:t>
+        <w:t xml:space="preserve">         ↓</w:t>
         <w:br/>
-        <w:t>[Stripe]    ← pagamentos</w:t>
+        <w:t xml:space="preserve">    [Stripe]     ← cobra assinantes, repassa para sua conta bancária</w:t>
         <w:br/>
-        <w:t>[Anthropic] ← Claude Haiku (via proxy)</w:t>
+        <w:t xml:space="preserve">    [Anthropic]  ← Claude Haiku gera o conteúdo</w:t>
       </w:r>
     </w:p>
     <w:p>
@@ -113,7 +122,7 @@
           <w:color w:val="1A5676"/>
           <w:sz w:val="28"/>
         </w:rPr>
-        <w:t>Serviços necessários e custos</w:t>
+        <w:t>O que contratar — apenas 4 serviços</w:t>
       </w:r>
     </w:p>
     <w:p>
@@ -125,226 +134,12 @@
           <w:color w:val="2E6D8E"/>
           <w:sz w:val="24"/>
         </w:rPr>
-        <w:t>1. Hospedagem do frontend</w:t>
-      </w:r>
-    </w:p>
-    <w:tbl>
-      <w:tblPr>
-        <w:tblStyle w:val="TableGrid"/>
-        <w:tblW w:type="auto" w:w="0"/>
-        <w:tblLook w:firstColumn="1" w:firstRow="1" w:lastColumn="0" w:lastRow="0" w:noHBand="0" w:noVBand="1" w:val="04A0"/>
-      </w:tblPr>
-      <w:tblGrid>
-        <w:gridCol w:w="3135"/>
-        <w:gridCol w:w="3135"/>
-        <w:gridCol w:w="3135"/>
-      </w:tblGrid>
-      <w:tr>
-        <w:tc>
-          <w:tcPr>
-            <w:tcW w:type="dxa" w:w="3135"/>
-            <w:shd w:val="clear" w:color="auto" w:fill="1a5676"/>
-          </w:tcPr>
-          <w:p>
-            <w:r>
-              <w:rPr>
-                <w:b/>
-                <w:color w:val="FFFFFF"/>
-              </w:rPr>
-              <w:t>Opção</w:t>
-            </w:r>
-          </w:p>
-        </w:tc>
-        <w:tc>
-          <w:tcPr>
-            <w:tcW w:type="dxa" w:w="3135"/>
-            <w:shd w:val="clear" w:color="auto" w:fill="1a5676"/>
-          </w:tcPr>
-          <w:p>
-            <w:r>
-              <w:rPr>
-                <w:b/>
-                <w:color w:val="FFFFFF"/>
-              </w:rPr>
-              <w:t>Custo</w:t>
-            </w:r>
-          </w:p>
-        </w:tc>
-        <w:tc>
-          <w:tcPr>
-            <w:tcW w:type="dxa" w:w="3135"/>
-            <w:shd w:val="clear" w:color="auto" w:fill="1a5676"/>
-          </w:tcPr>
-          <w:p>
-            <w:r>
-              <w:rPr>
-                <w:b/>
-                <w:color w:val="FFFFFF"/>
-              </w:rPr>
-              <w:t>Notas</w:t>
-            </w:r>
-          </w:p>
-        </w:tc>
-      </w:tr>
-      <w:tr>
-        <w:tc>
-          <w:tcPr>
-            <w:tcW w:type="dxa" w:w="3135"/>
-          </w:tcPr>
-          <w:p>
-            <w:r>
-              <w:t>GitHub Pages (atual)</w:t>
-            </w:r>
-          </w:p>
-        </w:tc>
-        <w:tc>
-          <w:tcPr>
-            <w:tcW w:type="dxa" w:w="3135"/>
-          </w:tcPr>
-          <w:p>
-            <w:r>
-              <w:t>Grátis</w:t>
-            </w:r>
-          </w:p>
-        </w:tc>
-        <w:tc>
-          <w:tcPr>
-            <w:tcW w:type="dxa" w:w="3135"/>
-          </w:tcPr>
-          <w:p>
-            <w:r>
-              <w:t>Ideal para começar; domínio personalizado grátis com CNAME</w:t>
-            </w:r>
-          </w:p>
-        </w:tc>
-      </w:tr>
-      <w:tr>
-        <w:tc>
-          <w:tcPr>
-            <w:tcW w:type="dxa" w:w="3135"/>
-          </w:tcPr>
-          <w:p>
-            <w:r>
-              <w:t>Vercel Hobby</w:t>
-            </w:r>
-          </w:p>
-        </w:tc>
-        <w:tc>
-          <w:tcPr>
-            <w:tcW w:type="dxa" w:w="3135"/>
-          </w:tcPr>
-          <w:p>
-            <w:r>
-              <w:t>Grátis</w:t>
-            </w:r>
-          </w:p>
-        </w:tc>
-        <w:tc>
-          <w:tcPr>
-            <w:tcW w:type="dxa" w:w="3135"/>
-          </w:tcPr>
-          <w:p>
-            <w:r>
-              <w:t>Melhor CDN, analytics básico, domínio personalizado grátis</w:t>
-            </w:r>
-          </w:p>
-        </w:tc>
-      </w:tr>
-      <w:tr>
-        <w:tc>
-          <w:tcPr>
-            <w:tcW w:type="dxa" w:w="3135"/>
-          </w:tcPr>
-          <w:p>
-            <w:r>
-              <w:t>Cloudflare Pages</w:t>
-            </w:r>
-          </w:p>
-        </w:tc>
-        <w:tc>
-          <w:tcPr>
-            <w:tcW w:type="dxa" w:w="3135"/>
-          </w:tcPr>
-          <w:p>
-            <w:r>
-              <w:t>Grátis</w:t>
-            </w:r>
-          </w:p>
-        </w:tc>
-        <w:tc>
-          <w:tcPr>
-            <w:tcW w:type="dxa" w:w="3135"/>
-          </w:tcPr>
-          <w:p>
-            <w:r>
-              <w:t>CDN global, build automático, domínio personalizado grátis</w:t>
-            </w:r>
-          </w:p>
-        </w:tc>
-      </w:tr>
-      <w:tr>
-        <w:tc>
-          <w:tcPr>
-            <w:tcW w:type="dxa" w:w="3135"/>
-          </w:tcPr>
-          <w:p>
-            <w:r>
-              <w:t>Netlify Starter</w:t>
-            </w:r>
-          </w:p>
-        </w:tc>
-        <w:tc>
-          <w:tcPr>
-            <w:tcW w:type="dxa" w:w="3135"/>
-          </w:tcPr>
-          <w:p>
-            <w:r>
-              <w:t>Grátis</w:t>
-            </w:r>
-          </w:p>
-        </w:tc>
-        <w:tc>
-          <w:tcPr>
-            <w:tcW w:type="dxa" w:w="3135"/>
-          </w:tcPr>
-          <w:p>
-            <w:r>
-              <w:t>Similar ao Vercel</w:t>
-            </w:r>
-          </w:p>
-        </w:tc>
-      </w:tr>
-    </w:tbl>
-    <w:p/>
-    <w:p>
-      <w:r/>
-      <w:r>
-        <w:rPr>
-          <w:b/>
-        </w:rPr>
-        <w:t>Recomendação:</w:t>
-      </w:r>
-      <w:r>
-        <w:t xml:space="preserve"> manter GitHub Pages por enquanto. Se precisar de analytics ou SSR no futuro, migrar para Vercel.</w:t>
+        <w:t>1. Supabase Pro — $25/mês (~R$125)</w:t>
       </w:r>
     </w:p>
     <w:p>
-      <w:pPr>
-        <w:pBdr>
-          <w:bottom w:val="single" w:sz="6" w:space="1" w:color="1a5676"/>
-        </w:pBdr>
-      </w:pPr>
-    </w:p>
-    <w:p>
-      <w:pPr>
-        <w:pStyle w:val="Heading3"/>
-      </w:pPr>
       <w:r>
-        <w:rPr>
-          <w:color w:val="2E6D8E"/>
-          <w:sz w:val="24"/>
-        </w:rPr>
-        <w:t>2. Banco de dados + Auth + Edge Functions — Supabase</w:t>
+        <w:t>É o único "servidor" real que você paga. O plano Pro libera as Edge Functions sem restrições de produção, garante backups diários e suporte.</w:t>
       </w:r>
     </w:p>
     <w:tbl>
@@ -400,7 +195,7 @@
                 <w:b/>
                 <w:color w:val="FFFFFF"/>
               </w:rPr>
-              <w:t>Limites relevantes</w:t>
+              <w:t>Para quando usar</w:t>
             </w:r>
           </w:p>
         </w:tc>
@@ -432,7 +227,7 @@
           </w:tcPr>
           <w:p>
             <w:r>
-              <w:t>500MB DB · 50MB armazenamento · 500K invocações Edge Function/mês · 2GB bandwidth</w:t>
+              <w:t>Desenvolvimento e testes</w:t>
             </w:r>
           </w:p>
         </w:tc>
@@ -454,7 +249,7 @@
           </w:tcPr>
           <w:p>
             <w:r>
-              <w:t>$25</w:t>
+              <w:t>$25 (~R$125)</w:t>
             </w:r>
           </w:p>
         </w:tc>
@@ -464,7 +259,7 @@
           </w:tcPr>
           <w:p>
             <w:r>
-              <w:t>8GB DB · 100GB armazenamento · 2M invocações Edge Function/mês · 250GB bandwidth · backups diários</w:t>
+              <w:t>Produção — contratar ao lançar</w:t>
             </w:r>
           </w:p>
         </w:tc>
@@ -496,7 +291,7 @@
           </w:tcPr>
           <w:p>
             <w:r>
-              <w:t>Múltiplos membros, SLA, suporte prioritário</w:t>
+              <w:t>Equipe grande, SLA garantido</w:t>
             </w:r>
           </w:p>
         </w:tc>
@@ -509,65 +304,10 @@
         <w:rPr>
           <w:b/>
         </w:rPr>
-        <w:t>Recomendação inicial:</w:t>
+        <w:t>Onde contratar:</w:t>
       </w:r>
       <w:r>
-        <w:t xml:space="preserve"> começar no </w:t>
-      </w:r>
-      <w:r>
-        <w:rPr>
-          <w:b/>
-        </w:rPr>
-        <w:t>Free</w:t>
-      </w:r>
-      <w:r>
-        <w:t>. O plano free suporta bem até ~500 usuários ativos.</w:t>
-      </w:r>
-    </w:p>
-    <w:p>
-      <w:r/>
-      <w:r>
-        <w:rPr>
-          <w:b/>
-        </w:rPr>
-        <w:t>Quando subir para Pro:</w:t>
-      </w:r>
-      <w:r>
-        <w:t xml:space="preserve"> quando ultrapassar 400 usuários cadastrados ou 400K Edge Function invocações/mês.</w:t>
-      </w:r>
-    </w:p>
-    <w:p>
-      <w:r/>
-      <w:r>
-        <w:rPr>
-          <w:b/>
-        </w:rPr>
-        <w:t>Estimativa de invocações/mês (plano Free — 500K limite):</w:t>
-      </w:r>
-      <w:r/>
-    </w:p>
-    <w:p>
-      <w:pPr>
-        <w:pStyle w:val="ListBullet"/>
-      </w:pPr>
-      <w:r>
-        <w:t>500 usuários × 20 gerações/mês × 1 chamada proxy = 10.000 invocações</w:t>
-      </w:r>
-    </w:p>
-    <w:p>
-      <w:pPr>
-        <w:pStyle w:val="ListBullet"/>
-      </w:pPr>
-      <w:r>
-        <w:t>Stripe webhook: ~5 eventos/assinatura × 100 assinaturas = 500 invocações</w:t>
-      </w:r>
-    </w:p>
-    <w:p>
-      <w:pPr>
-        <w:pStyle w:val="ListBullet"/>
-      </w:pPr>
-      <w:r>
-        <w:t>Total estimado com 500 usuários ativos: ~11.000/mês (bem dentro do free tier)</w:t>
+        <w:t xml:space="preserve"> supabase.com → seu projeto → Settings → Billing → Upgrade to Pro</w:t>
       </w:r>
     </w:p>
     <w:p>
@@ -586,7 +326,12 @@
           <w:color w:val="2E6D8E"/>
           <w:sz w:val="24"/>
         </w:rPr>
-        <w:t>3. Pagamentos — Stripe</w:t>
+        <w:t>2. Stripe — gratuito (cobra por transação)</w:t>
+      </w:r>
+    </w:p>
+    <w:p>
+      <w:r>
+        <w:t>Sem mensalidade. Você paga somente quando recebe.</w:t>
       </w:r>
     </w:p>
     <w:tbl>
@@ -642,7 +387,7 @@
                 <w:b/>
                 <w:color w:val="FFFFFF"/>
               </w:rPr>
-              <w:t>Observações</w:t>
+              <w:t>Você recebe (R$29,90)</w:t>
             </w:r>
           </w:p>
         </w:tc>
@@ -654,7 +399,7 @@
           </w:tcPr>
           <w:p>
             <w:r>
-              <w:t>Cartão de crédito (Brasil)</w:t>
+              <w:t>Cartão de crédito</w:t>
             </w:r>
           </w:p>
         </w:tc>
@@ -664,7 +409,7 @@
           </w:tcPr>
           <w:p>
             <w:r>
-              <w:t>3,49% + R$0,39 por transação</w:t>
+              <w:t>3,49% + R$0,39</w:t>
             </w:r>
           </w:p>
         </w:tc>
@@ -674,7 +419,7 @@
           </w:tcPr>
           <w:p>
             <w:r>
-              <w:t>Para assinaturas recorrentes em BRL</w:t>
+              <w:t>~R$28,47</w:t>
             </w:r>
           </w:p>
         </w:tc>
@@ -686,7 +431,7 @@
           </w:tcPr>
           <w:p>
             <w:r>
-              <w:t>PIX (via Stripe)</w:t>
+              <w:t>PIX</w:t>
             </w:r>
           </w:p>
         </w:tc>
@@ -696,7 +441,7 @@
           </w:tcPr>
           <w:p>
             <w:r>
-              <w:t>1% (mín. R$0,50, máx. R$5,00)</w:t>
+              <w:t>1% (mín. R$0,50)</w:t>
             </w:r>
           </w:p>
         </w:tc>
@@ -706,7 +451,7 @@
           </w:tcPr>
           <w:p>
             <w:r>
-              <w:t>Disponível no Stripe Brasil desde 2023</w:t>
+              <w:t>~R$29,40</w:t>
             </w:r>
           </w:p>
         </w:tc>
@@ -718,7 +463,7 @@
           </w:tcPr>
           <w:p>
             <w:r>
-              <w:t>Boleto bancário</w:t>
+              <w:t>Boleto</w:t>
             </w:r>
           </w:p>
         </w:tc>
@@ -738,7 +483,7 @@
           </w:tcPr>
           <w:p>
             <w:r>
-              <w:t>Disponível, mas taxa de inadimplência alta</w:t>
+              <w:t>~R$27,95</w:t>
             </w:r>
           </w:p>
         </w:tc>
@@ -751,10 +496,10 @@
         <w:rPr>
           <w:b/>
         </w:rPr>
-        <w:t>Conta Stripe:</w:t>
+        <w:t>Recomendação:</w:t>
       </w:r>
       <w:r>
-        <w:t xml:space="preserve"> gratuita. Só paga quando há transações.</w:t>
+        <w:t xml:space="preserve"> aceitar cartão e PIX. Boleto tem inadimplência alta — não compensa.</w:t>
       </w:r>
     </w:p>
     <w:p>
@@ -763,59 +508,7 @@
         <w:rPr>
           <w:b/>
         </w:rPr>
-        <w:t>Para o plano R$19,90/mês no cartão:</w:t>
-      </w:r>
-      <w:r/>
-    </w:p>
-    <w:p>
-      <w:pPr>
-        <w:pStyle w:val="ListBullet"/>
-      </w:pPr>
-      <w:r>
-        <w:t>Taxa Stripe: R$0,69 + R$0,39 = R$1,08 por cobrança</w:t>
-      </w:r>
-    </w:p>
-    <w:p>
-      <w:pPr>
-        <w:pStyle w:val="ListBullet"/>
-      </w:pPr>
-      <w:r>
-        <w:t>Você recebe: R$18,82 por assinatura/mês</w:t>
-      </w:r>
-    </w:p>
-    <w:p>
-      <w:r/>
-      <w:r>
-        <w:rPr>
-          <w:b/>
-        </w:rPr>
-        <w:t>Para o plano R$19,90/mês via PIX:</w:t>
-      </w:r>
-      <w:r/>
-    </w:p>
-    <w:p>
-      <w:pPr>
-        <w:pStyle w:val="ListBullet"/>
-      </w:pPr>
-      <w:r>
-        <w:t>Taxa Stripe: R$0,20 (1% de R$19,90, acima do mínimo de R$0,50 → R$0,50)</w:t>
-      </w:r>
-    </w:p>
-    <w:p>
-      <w:pPr>
-        <w:pStyle w:val="ListBullet"/>
-      </w:pPr>
-      <w:r>
-        <w:t>Você recebe: R$19,40 por assinatura/mês</w:t>
-      </w:r>
-    </w:p>
-    <w:p>
-      <w:r/>
-      <w:r>
-        <w:rPr>
-          <w:b/>
-        </w:rPr>
-        <w:t>Requisitos para ativar Stripe no Brasil:</w:t>
+        <w:t>Requisitos para ativar no Brasil:</w:t>
       </w:r>
       <w:r/>
     </w:p>
@@ -840,7 +533,19 @@
         <w:pStyle w:val="ListBullet"/>
       </w:pPr>
       <w:r>
-        <w:t>Documento de identidade para verificação KYC</w:t>
+        <w:t>Documento de identidade (verificação KYC)</w:t>
+      </w:r>
+    </w:p>
+    <w:p>
+      <w:r/>
+      <w:r>
+        <w:rPr>
+          <w:b/>
+        </w:rPr>
+        <w:t>Onde contratar:</w:t>
+      </w:r>
+      <w:r>
+        <w:t xml:space="preserve"> stripe.com</w:t>
       </w:r>
     </w:p>
     <w:p>
@@ -859,12 +564,12 @@
           <w:color w:val="2E6D8E"/>
           <w:sz w:val="24"/>
         </w:rPr>
-        <w:t>4. IA — Anthropic (Claude Haiku 4.5)</w:t>
+        <w:t>3. Anthropic API — pago por uso (~R$0,50/usuário premium/mês)</w:t>
       </w:r>
     </w:p>
     <w:p>
       <w:r>
-        <w:t xml:space="preserve">&gt; Custo do modelo </w:t>
+        <w:t xml:space="preserve">Custo do modelo </w:t>
       </w:r>
       <w:r>
         <w:rPr>
@@ -926,7 +631,7 @@
           </w:tcPr>
           <w:p>
             <w:r>
-              <w:t>Input (contexto + prompt)</w:t>
+              <w:t>Input (prompt)</w:t>
             </w:r>
           </w:p>
         </w:tc>
@@ -948,7 +653,7 @@
           </w:tcPr>
           <w:p>
             <w:r>
-              <w:t>Output (resposta gerada)</w:t>
+              <w:t>Output (resposta)</w:t>
             </w:r>
           </w:p>
         </w:tc>
@@ -971,7 +676,173 @@
         <w:rPr>
           <w:b/>
         </w:rPr>
-        <w:t>Estimativa de custo por geração:</w:t>
+        <w:t>Custo estimado por tipo de geração:</w:t>
+      </w:r>
+      <w:r/>
+    </w:p>
+    <w:tbl>
+      <w:tblPr>
+        <w:tblStyle w:val="TableGrid"/>
+        <w:tblW w:type="auto" w:w="0"/>
+        <w:tblLook w:firstColumn="1" w:firstRow="1" w:lastColumn="0" w:lastRow="0" w:noHBand="0" w:noVBand="1" w:val="04A0"/>
+      </w:tblPr>
+      <w:tblGrid>
+        <w:gridCol w:w="3135"/>
+        <w:gridCol w:w="3135"/>
+        <w:gridCol w:w="3135"/>
+      </w:tblGrid>
+      <w:tr>
+        <w:tc>
+          <w:tcPr>
+            <w:tcW w:type="dxa" w:w="3135"/>
+            <w:shd w:val="clear" w:color="auto" w:fill="1a5676"/>
+          </w:tcPr>
+          <w:p>
+            <w:r>
+              <w:rPr>
+                <w:b/>
+                <w:color w:val="FFFFFF"/>
+              </w:rPr>
+              <w:t>Geração</w:t>
+            </w:r>
+          </w:p>
+        </w:tc>
+        <w:tc>
+          <w:tcPr>
+            <w:tcW w:type="dxa" w:w="3135"/>
+            <w:shd w:val="clear" w:color="auto" w:fill="1a5676"/>
+          </w:tcPr>
+          <w:p>
+            <w:r>
+              <w:rPr>
+                <w:b/>
+                <w:color w:val="FFFFFF"/>
+              </w:rPr>
+              <w:t>Input + Output</w:t>
+            </w:r>
+          </w:p>
+        </w:tc>
+        <w:tc>
+          <w:tcPr>
+            <w:tcW w:type="dxa" w:w="3135"/>
+            <w:shd w:val="clear" w:color="auto" w:fill="1a5676"/>
+          </w:tcPr>
+          <w:p>
+            <w:r>
+              <w:rPr>
+                <w:b/>
+                <w:color w:val="FFFFFF"/>
+              </w:rPr>
+              <w:t>Custo</w:t>
+            </w:r>
+          </w:p>
+        </w:tc>
+      </w:tr>
+      <w:tr>
+        <w:tc>
+          <w:tcPr>
+            <w:tcW w:type="dxa" w:w="3135"/>
+          </w:tcPr>
+          <w:p>
+            <w:r>
+              <w:t>Historinha</w:t>
+            </w:r>
+          </w:p>
+        </w:tc>
+        <w:tc>
+          <w:tcPr>
+            <w:tcW w:type="dxa" w:w="3135"/>
+          </w:tcPr>
+          <w:p>
+            <w:r>
+              <w:t>~800 + 800 tokens</w:t>
+            </w:r>
+          </w:p>
+        </w:tc>
+        <w:tc>
+          <w:tcPr>
+            <w:tcW w:type="dxa" w:w="3135"/>
+          </w:tcPr>
+          <w:p>
+            <w:r>
+              <w:t>~R$0,02</w:t>
+            </w:r>
+          </w:p>
+        </w:tc>
+      </w:tr>
+      <w:tr>
+        <w:tc>
+          <w:tcPr>
+            <w:tcW w:type="dxa" w:w="3135"/>
+          </w:tcPr>
+          <w:p>
+            <w:r>
+              <w:t>Simulado</w:t>
+            </w:r>
+          </w:p>
+        </w:tc>
+        <w:tc>
+          <w:tcPr>
+            <w:tcW w:type="dxa" w:w="3135"/>
+          </w:tcPr>
+          <w:p>
+            <w:r>
+              <w:t>~600 + 1500 tokens</w:t>
+            </w:r>
+          </w:p>
+        </w:tc>
+        <w:tc>
+          <w:tcPr>
+            <w:tcW w:type="dxa" w:w="3135"/>
+          </w:tcPr>
+          <w:p>
+            <w:r>
+              <w:t>~R$0,03</w:t>
+            </w:r>
+          </w:p>
+        </w:tc>
+      </w:tr>
+      <w:tr>
+        <w:tc>
+          <w:tcPr>
+            <w:tcW w:type="dxa" w:w="3135"/>
+          </w:tcPr>
+          <w:p>
+            <w:r>
+              <w:t>Correção redação</w:t>
+            </w:r>
+          </w:p>
+        </w:tc>
+        <w:tc>
+          <w:tcPr>
+            <w:tcW w:type="dxa" w:w="3135"/>
+          </w:tcPr>
+          <w:p>
+            <w:r>
+              <w:t>~1200 + 1000 tokens</w:t>
+            </w:r>
+          </w:p>
+        </w:tc>
+        <w:tc>
+          <w:tcPr>
+            <w:tcW w:type="dxa" w:w="3135"/>
+          </w:tcPr>
+          <w:p>
+            <w:r>
+              <w:t>~R$0,03</w:t>
+            </w:r>
+          </w:p>
+        </w:tc>
+      </w:tr>
+    </w:tbl>
+    <w:p/>
+    <w:p>
+      <w:r/>
+      <w:r>
+        <w:rPr>
+          <w:b/>
+        </w:rPr>
+        <w:t>Projeção mensal por usuário premium (20 gerações/mês):</w:t>
       </w:r>
       <w:r/>
     </w:p>
@@ -980,23 +851,12 @@
         <w:pStyle w:val="ListBullet"/>
       </w:pPr>
       <w:r>
-        <w:t>Historinha: ~800 input + 800 output → $0,00064 + $0,0032 = $0,0038 (~R$0,02)</w:t>
+        <w:t>Média R$0,025 × 20 = ~R$0,50/usuário/mês</w:t>
       </w:r>
     </w:p>
     <w:p>
-      <w:pPr>
-        <w:pStyle w:val="ListBullet"/>
-      </w:pPr>
       <w:r>
-        <w:t>Simulado: ~600 input + 1500 output → $0,00048 + $0,006 = $0,0065 (~R$0,03)</w:t>
-      </w:r>
-    </w:p>
-    <w:p>
-      <w:pPr>
-        <w:pStyle w:val="ListBullet"/>
-      </w:pPr>
-      <w:r>
-        <w:t>Correção redação: ~1200 input + 1000 output → $0,00096 + $0,004 = $0,005 (~R$0,03)</w:t>
+        <w:t>Sem mensalidade — cobra só o que consumir.</w:t>
       </w:r>
     </w:p>
     <w:p>
@@ -1005,58 +865,10 @@
         <w:rPr>
           <w:b/>
         </w:rPr>
-        <w:t>Projeção de custo Anthropic por usuário premium (20 gerações/mês):</w:t>
+        <w:t>Onde contratar:</w:t>
       </w:r>
-      <w:r/>
-    </w:p>
-    <w:p>
-      <w:pPr>
-        <w:pStyle w:val="ListBullet"/>
-      </w:pPr>
       <w:r>
-        <w:t>Média de $0,005 por geração × 20 = $0,10/usuário/mês (~R$0,50)</w:t>
-      </w:r>
-    </w:p>
-    <w:p>
-      <w:pPr>
-        <w:pStyle w:val="ListBullet"/>
-      </w:pPr>
-      <w:r>
-        <w:t>Com 100 usuários premium: ~$10/mês (~R$50) em API Anthropic</w:t>
-      </w:r>
-    </w:p>
-    <w:p>
-      <w:r/>
-      <w:r>
-        <w:rPr>
-          <w:b/>
-        </w:rPr>
-        <w:t>Margem por usuário premium (R$19,90/mês cartão):</w:t>
-      </w:r>
-      <w:r/>
-    </w:p>
-    <w:p>
-      <w:pPr>
-        <w:pStyle w:val="ListBullet"/>
-      </w:pPr>
-      <w:r>
-        <w:t>Stripe fee: -R$1,08</w:t>
-      </w:r>
-    </w:p>
-    <w:p>
-      <w:pPr>
-        <w:pStyle w:val="ListBullet"/>
-      </w:pPr>
-      <w:r>
-        <w:t>Anthropic: -R$0,50</w:t>
-      </w:r>
-    </w:p>
-    <w:p>
-      <w:pPr>
-        <w:pStyle w:val="ListBullet"/>
-      </w:pPr>
-      <w:r>
-        <w:t>Margem líquida: ~R$18,32/usuário/mês</w:t>
+        <w:t xml:space="preserve"> console.anthropic.com → API Keys → adicionar cartão de crédito</w:t>
       </w:r>
     </w:p>
     <w:p>
@@ -1075,7 +887,7 @@
           <w:color w:val="2E6D8E"/>
           <w:sz w:val="24"/>
         </w:rPr>
-        <w:t>5. Domínio personalizado</w:t>
+        <w:t>4. Domínio personalizado — ~R$40/ano (~R$3,50/mês)</w:t>
       </w:r>
     </w:p>
     <w:tbl>
@@ -1101,7 +913,7 @@
                 <w:b/>
                 <w:color w:val="FFFFFF"/>
               </w:rPr>
-              <w:t>Domínio</w:t>
+              <w:t>Opção</w:t>
             </w:r>
           </w:p>
         </w:tc>
@@ -1163,7 +975,7 @@
           </w:tcPr>
           <w:p>
             <w:r>
-              <w:t>R$40,00</w:t>
+              <w:t>R$40</w:t>
             </w:r>
           </w:p>
         </w:tc>
@@ -1195,7 +1007,7 @@
           </w:tcPr>
           <w:p>
             <w:r>
-              <w:t>~$10,00 (~R$50)</w:t>
+              <w:t>~R$50</w:t>
             </w:r>
           </w:p>
         </w:tc>
@@ -1227,7 +1039,7 @@
           </w:tcPr>
           <w:p>
             <w:r>
-              <w:t>~$80-120/ano</w:t>
+              <w:t>~R$400–600</w:t>
             </w:r>
           </w:p>
         </w:tc>
@@ -1253,7 +1065,19 @@
         <w:t>estudaai.com.br</w:t>
       </w:r>
       <w:r>
-        <w:t xml:space="preserve"> no Registro.br — mais barato, .br passa mais confiança para o público brasileiro.</w:t>
+        <w:t xml:space="preserve"> no Registro.br. Mais barato, .br passa mais confiança para o público brasileiro.</w:t>
+      </w:r>
+    </w:p>
+    <w:p>
+      <w:r/>
+      <w:r>
+        <w:rPr>
+          <w:b/>
+        </w:rPr>
+        <w:t>Onde contratar:</w:t>
+      </w:r>
+      <w:r>
+        <w:t xml:space="preserve"> registro.br (requer CPF)</w:t>
       </w:r>
     </w:p>
     <w:p>
@@ -1272,19 +1096,7 @@
           <w:color w:val="1A5676"/>
           <w:sz w:val="28"/>
         </w:rPr>
-        <w:t>Resumo de custos mensais</w:t>
-      </w:r>
-    </w:p>
-    <w:p>
-      <w:pPr>
-        <w:pStyle w:val="Heading3"/>
-      </w:pPr>
-      <w:r>
-        <w:rPr>
-          <w:color w:val="2E6D8E"/>
-          <w:sz w:val="24"/>
-        </w:rPr>
-        <w:t>Fase 0 — Lançamento (0–50 usuários premium)</w:t>
+        <w:t>O que você NÃO precisa contratar</w:t>
       </w:r>
     </w:p>
     <w:tbl>
@@ -1309,7 +1121,367 @@
                 <w:b/>
                 <w:color w:val="FFFFFF"/>
               </w:rPr>
-              <w:t>Serviço</w:t>
+              <w:t>O que parece necessário</w:t>
+            </w:r>
+          </w:p>
+        </w:tc>
+        <w:tc>
+          <w:tcPr>
+            <w:tcW w:type="dxa" w:w="4703"/>
+            <w:shd w:val="clear" w:color="auto" w:fill="1a5676"/>
+          </w:tcPr>
+          <w:p>
+            <w:r>
+              <w:rPr>
+                <w:b/>
+                <w:color w:val="FFFFFF"/>
+              </w:rPr>
+              <w:t>Por que não precisa</w:t>
+            </w:r>
+          </w:p>
+        </w:tc>
+      </w:tr>
+      <w:tr>
+        <w:tc>
+          <w:tcPr>
+            <w:tcW w:type="dxa" w:w="4703"/>
+          </w:tcPr>
+          <w:p>
+            <w:r>
+              <w:t>VPS (DigitalOcean, AWS EC2, Hetzner)</w:t>
+            </w:r>
+          </w:p>
+        </w:tc>
+        <w:tc>
+          <w:tcPr>
+            <w:tcW w:type="dxa" w:w="4703"/>
+          </w:tcPr>
+          <w:p>
+            <w:r>
+              <w:t>Supabase Edge Functions substitui</w:t>
+            </w:r>
+          </w:p>
+        </w:tc>
+      </w:tr>
+      <w:tr>
+        <w:tc>
+          <w:tcPr>
+            <w:tcW w:type="dxa" w:w="4703"/>
+          </w:tcPr>
+          <w:p>
+            <w:r>
+              <w:t>Hosting pago para o frontend</w:t>
+            </w:r>
+          </w:p>
+        </w:tc>
+        <w:tc>
+          <w:tcPr>
+            <w:tcW w:type="dxa" w:w="4703"/>
+          </w:tcPr>
+          <w:p>
+            <w:r>
+              <w:t>GitHub Pages é gratuito e suficiente para HTML estático</w:t>
+            </w:r>
+          </w:p>
+        </w:tc>
+      </w:tr>
+      <w:tr>
+        <w:tc>
+          <w:tcPr>
+            <w:tcW w:type="dxa" w:w="4703"/>
+          </w:tcPr>
+          <w:p>
+            <w:r>
+              <w:t>CDN pago</w:t>
+            </w:r>
+          </w:p>
+        </w:tc>
+        <w:tc>
+          <w:tcPr>
+            <w:tcW w:type="dxa" w:w="4703"/>
+          </w:tcPr>
+          <w:p>
+            <w:r>
+              <w:t>GitHub Pages já usa CDN global</w:t>
+            </w:r>
+          </w:p>
+        </w:tc>
+      </w:tr>
+      <w:tr>
+        <w:tc>
+          <w:tcPr>
+            <w:tcW w:type="dxa" w:w="4703"/>
+          </w:tcPr>
+          <w:p>
+            <w:r>
+              <w:t>Servidor de e-mail</w:t>
+            </w:r>
+          </w:p>
+        </w:tc>
+        <w:tc>
+          <w:tcPr>
+            <w:tcW w:type="dxa" w:w="4703"/>
+          </w:tcPr>
+          <w:p>
+            <w:r>
+              <w:t>Supabase Auth já envia confirmação de cadastro</w:t>
+            </w:r>
+          </w:p>
+        </w:tc>
+      </w:tr>
+      <w:tr>
+        <w:tc>
+          <w:tcPr>
+            <w:tcW w:type="dxa" w:w="4703"/>
+          </w:tcPr>
+          <w:p>
+            <w:r>
+              <w:t>Servidor Node.js/Python próprio</w:t>
+            </w:r>
+          </w:p>
+        </w:tc>
+        <w:tc>
+          <w:tcPr>
+            <w:tcW w:type="dxa" w:w="4703"/>
+          </w:tcPr>
+          <w:p>
+            <w:r>
+              <w:t>Toda lógica de servidor vai nas Edge Functions do Supabase</w:t>
+            </w:r>
+          </w:p>
+        </w:tc>
+      </w:tr>
+    </w:tbl>
+    <w:p/>
+    <w:p>
+      <w:pPr>
+        <w:pBdr>
+          <w:bottom w:val="single" w:sz="6" w:space="1" w:color="1a5676"/>
+        </w:pBdr>
+      </w:pPr>
+    </w:p>
+    <w:p>
+      <w:pPr>
+        <w:pStyle w:val="Heading2"/>
+      </w:pPr>
+      <w:r>
+        <w:rPr>
+          <w:color w:val="1A5676"/>
+          <w:sz w:val="28"/>
+        </w:rPr>
+        <w:t>Planos do Estuda.AI</w:t>
+      </w:r>
+    </w:p>
+    <w:tbl>
+      <w:tblPr>
+        <w:tblStyle w:val="TableGrid"/>
+        <w:tblW w:type="auto" w:w="0"/>
+        <w:tblLook w:firstColumn="1" w:firstRow="1" w:lastColumn="0" w:lastRow="0" w:noHBand="0" w:noVBand="1" w:val="04A0"/>
+      </w:tblPr>
+      <w:tblGrid>
+        <w:gridCol w:w="3135"/>
+        <w:gridCol w:w="3135"/>
+        <w:gridCol w:w="3135"/>
+      </w:tblGrid>
+      <w:tr>
+        <w:tc>
+          <w:tcPr>
+            <w:tcW w:type="dxa" w:w="3135"/>
+            <w:shd w:val="clear" w:color="auto" w:fill="1a5676"/>
+          </w:tcPr>
+          <w:p>
+            <w:r>
+              <w:rPr>
+                <w:b/>
+                <w:color w:val="FFFFFF"/>
+              </w:rPr>
+              <w:t>Plano</w:t>
+            </w:r>
+          </w:p>
+        </w:tc>
+        <w:tc>
+          <w:tcPr>
+            <w:tcW w:type="dxa" w:w="3135"/>
+            <w:shd w:val="clear" w:color="auto" w:fill="1a5676"/>
+          </w:tcPr>
+          <w:p>
+            <w:r>
+              <w:rPr>
+                <w:b/>
+                <w:color w:val="FFFFFF"/>
+              </w:rPr>
+              <w:t>Preço</w:t>
+            </w:r>
+          </w:p>
+        </w:tc>
+        <w:tc>
+          <w:tcPr>
+            <w:tcW w:type="dxa" w:w="3135"/>
+            <w:shd w:val="clear" w:color="auto" w:fill="1a5676"/>
+          </w:tcPr>
+          <w:p>
+            <w:r>
+              <w:rPr>
+                <w:b/>
+                <w:color w:val="FFFFFF"/>
+              </w:rPr>
+              <w:t>Valor mensal efetivo</w:t>
+            </w:r>
+          </w:p>
+        </w:tc>
+      </w:tr>
+      <w:tr>
+        <w:tc>
+          <w:tcPr>
+            <w:tcW w:type="dxa" w:w="3135"/>
+          </w:tcPr>
+          <w:p>
+            <w:r>
+              <w:t>Free</w:t>
+            </w:r>
+          </w:p>
+        </w:tc>
+        <w:tc>
+          <w:tcPr>
+            <w:tcW w:type="dxa" w:w="3135"/>
+          </w:tcPr>
+          <w:p>
+            <w:r>
+              <w:t>Gratuito</w:t>
+            </w:r>
+          </w:p>
+        </w:tc>
+        <w:tc>
+          <w:tcPr>
+            <w:tcW w:type="dxa" w:w="3135"/>
+          </w:tcPr>
+          <w:p>
+            <w:r>
+              <w:t>—</w:t>
+            </w:r>
+          </w:p>
+        </w:tc>
+      </w:tr>
+      <w:tr>
+        <w:tc>
+          <w:tcPr>
+            <w:tcW w:type="dxa" w:w="3135"/>
+          </w:tcPr>
+          <w:p>
+            <w:r>
+              <w:t>Premium Mensal</w:t>
+            </w:r>
+          </w:p>
+        </w:tc>
+        <w:tc>
+          <w:tcPr>
+            <w:tcW w:type="dxa" w:w="3135"/>
+          </w:tcPr>
+          <w:p>
+            <w:r>
+              <w:t>R$29,90/mês</w:t>
+            </w:r>
+          </w:p>
+        </w:tc>
+        <w:tc>
+          <w:tcPr>
+            <w:tcW w:type="dxa" w:w="3135"/>
+          </w:tcPr>
+          <w:p>
+            <w:r>
+              <w:t>R$29,90</w:t>
+            </w:r>
+          </w:p>
+        </w:tc>
+      </w:tr>
+      <w:tr>
+        <w:tc>
+          <w:tcPr>
+            <w:tcW w:type="dxa" w:w="3135"/>
+          </w:tcPr>
+          <w:p>
+            <w:r>
+              <w:t>Premium Anual</w:t>
+            </w:r>
+          </w:p>
+        </w:tc>
+        <w:tc>
+          <w:tcPr>
+            <w:tcW w:type="dxa" w:w="3135"/>
+          </w:tcPr>
+          <w:p>
+            <w:r>
+              <w:t>R$239/ano</w:t>
+            </w:r>
+          </w:p>
+        </w:tc>
+        <w:tc>
+          <w:tcPr>
+            <w:tcW w:type="dxa" w:w="3135"/>
+          </w:tcPr>
+          <w:p>
+            <w:r>
+              <w:t>~R$19,92 (33% de desconto)</w:t>
+            </w:r>
+          </w:p>
+        </w:tc>
+      </w:tr>
+    </w:tbl>
+    <w:p/>
+    <w:p>
+      <w:pPr>
+        <w:pBdr>
+          <w:bottom w:val="single" w:sz="6" w:space="1" w:color="1a5676"/>
+        </w:pBdr>
+      </w:pPr>
+    </w:p>
+    <w:p>
+      <w:pPr>
+        <w:pStyle w:val="Heading2"/>
+      </w:pPr>
+      <w:r>
+        <w:rPr>
+          <w:color w:val="1A5676"/>
+          <w:sz w:val="28"/>
+        </w:rPr>
+        <w:t>Projeção financeira</w:t>
+      </w:r>
+    </w:p>
+    <w:p>
+      <w:pPr>
+        <w:pStyle w:val="Heading3"/>
+      </w:pPr>
+      <w:r>
+        <w:rPr>
+          <w:color w:val="2E6D8E"/>
+          <w:sz w:val="24"/>
+        </w:rPr>
+        <w:t>Fase 0 — Lançamento (até 50 usuários premium)</w:t>
+      </w:r>
+    </w:p>
+    <w:tbl>
+      <w:tblPr>
+        <w:tblStyle w:val="TableGrid"/>
+        <w:tblW w:type="auto" w:w="0"/>
+        <w:tblLook w:firstColumn="1" w:firstRow="1" w:lastColumn="0" w:lastRow="0" w:noHBand="0" w:noVBand="1" w:val="04A0"/>
+      </w:tblPr>
+      <w:tblGrid>
+        <w:gridCol w:w="4703"/>
+        <w:gridCol w:w="4703"/>
+      </w:tblGrid>
+      <w:tr>
+        <w:tc>
+          <w:tcPr>
+            <w:tcW w:type="dxa" w:w="4703"/>
+            <w:shd w:val="clear" w:color="auto" w:fill="1a5676"/>
+          </w:tcPr>
+          <w:p>
+            <w:r>
+              <w:rPr>
+                <w:b/>
+                <w:color w:val="FFFFFF"/>
+              </w:rPr>
+              <w:t>Item</w:t>
             </w:r>
           </w:p>
         </w:tc>
@@ -1358,7 +1530,7 @@
           </w:tcPr>
           <w:p>
             <w:r>
-              <w:t>Supabase Free</w:t>
+              <w:t>Supabase Pro</w:t>
             </w:r>
           </w:p>
         </w:tc>
@@ -1368,7 +1540,7 @@
           </w:tcPr>
           <w:p>
             <w:r>
-              <w:t>R$0</w:t>
+              <w:t>R$125</w:t>
             </w:r>
           </w:p>
         </w:tc>
@@ -1380,29 +1552,7 @@
           </w:tcPr>
           <w:p>
             <w:r>
-              <w:t>Stripe (sem assinaturas ativas)</w:t>
-            </w:r>
-          </w:p>
-        </w:tc>
-        <w:tc>
-          <w:tcPr>
-            <w:tcW w:type="dxa" w:w="4703"/>
-          </w:tcPr>
-          <w:p>
-            <w:r>
-              <w:t>R$0</w:t>
-            </w:r>
-          </w:p>
-        </w:tc>
-      </w:tr>
-      <w:tr>
-        <w:tc>
-          <w:tcPr>
-            <w:tcW w:type="dxa" w:w="4703"/>
-          </w:tcPr>
-          <w:p>
-            <w:r>
-              <w:t>Anthropic API (50 usuários × R$0,50)</w:t>
+              <w:t>Anthropic (50 × R$0,50)</w:t>
             </w:r>
           </w:p>
         </w:tc>
@@ -1424,7 +1574,29 @@
           </w:tcPr>
           <w:p>
             <w:r>
-              <w:t>Domínio (amortizado/mês)</w:t>
+              <w:t>Stripe fees (50 × R$1,43)</w:t>
+            </w:r>
+          </w:p>
+        </w:tc>
+        <w:tc>
+          <w:tcPr>
+            <w:tcW w:type="dxa" w:w="4703"/>
+          </w:tcPr>
+          <w:p>
+            <w:r>
+              <w:t>~R$72</w:t>
+            </w:r>
+          </w:p>
+        </w:tc>
+      </w:tr>
+      <w:tr>
+        <w:tc>
+          <w:tcPr>
+            <w:tcW w:type="dxa" w:w="4703"/>
+          </w:tcPr>
+          <w:p>
+            <w:r>
+              <w:t>Domínio (amortizado)</w:t>
             </w:r>
           </w:p>
         </w:tc>
@@ -1446,7 +1618,7 @@
           </w:tcPr>
           <w:p>
             <w:r>
-              <w:t>TOTAL</w:t>
+              <w:t>Custo total</w:t>
             </w:r>
           </w:p>
         </w:tc>
@@ -1456,7 +1628,7 @@
           </w:tcPr>
           <w:p>
             <w:r>
-              <w:t>~R$28,50/mês</w:t>
+              <w:t>~R$225,50</w:t>
             </w:r>
           </w:p>
         </w:tc>
@@ -1468,7 +1640,7 @@
           </w:tcPr>
           <w:p>
             <w:r>
-              <w:t>Receita (50 assinantes)</w:t>
+              <w:t>Receita bruta (50 × R$29,90)</w:t>
             </w:r>
           </w:p>
         </w:tc>
@@ -1478,7 +1650,7 @@
           </w:tcPr>
           <w:p>
             <w:r>
-              <w:t>R$941/mês</w:t>
+              <w:t>R$1.495</w:t>
             </w:r>
           </w:p>
         </w:tc>
@@ -1490,7 +1662,7 @@
           </w:tcPr>
           <w:p>
             <w:r>
-              <w:t>Margem</w:t>
+              <w:t>Margem líquida</w:t>
             </w:r>
           </w:p>
         </w:tc>
@@ -1500,7 +1672,29 @@
           </w:tcPr>
           <w:p>
             <w:r>
-              <w:t>~97%</w:t>
+              <w:t>~R$1.269 (~85%)</w:t>
+            </w:r>
+          </w:p>
+        </w:tc>
+      </w:tr>
+      <w:tr>
+        <w:tc>
+          <w:tcPr>
+            <w:tcW w:type="dxa" w:w="4703"/>
+          </w:tcPr>
+          <w:p>
+            <w:r>
+              <w:t>Break-even</w:t>
+            </w:r>
+          </w:p>
+        </w:tc>
+        <w:tc>
+          <w:tcPr>
+            <w:tcW w:type="dxa" w:w="4703"/>
+          </w:tcPr>
+          <w:p>
+            <w:r>
+              <w:t>8 assinantes</w:t>
             </w:r>
           </w:p>
         </w:tc>
@@ -1541,7 +1735,7 @@
                 <w:b/>
                 <w:color w:val="FFFFFF"/>
               </w:rPr>
-              <w:t>Serviço</w:t>
+              <w:t>Item</w:t>
             </w:r>
           </w:p>
         </w:tc>
@@ -1568,7 +1762,7 @@
           </w:tcPr>
           <w:p>
             <w:r>
-              <w:t>GitHub Pages ou Vercel</w:t>
+              <w:t>Supabase Pro</w:t>
             </w:r>
           </w:p>
         </w:tc>
@@ -1578,7 +1772,7 @@
           </w:tcPr>
           <w:p>
             <w:r>
-              <w:t>R$0</w:t>
+              <w:t>R$125</w:t>
             </w:r>
           </w:p>
         </w:tc>
@@ -1590,29 +1784,7 @@
           </w:tcPr>
           <w:p>
             <w:r>
-              <w:t>Supabase Free (até ~400 usuários)</w:t>
-            </w:r>
-          </w:p>
-        </w:tc>
-        <w:tc>
-          <w:tcPr>
-            <w:tcW w:type="dxa" w:w="4703"/>
-          </w:tcPr>
-          <w:p>
-            <w:r>
-              <w:t>R$0</w:t>
-            </w:r>
-          </w:p>
-        </w:tc>
-      </w:tr>
-      <w:tr>
-        <w:tc>
-          <w:tcPr>
-            <w:tcW w:type="dxa" w:w="4703"/>
-          </w:tcPr>
-          <w:p>
-            <w:r>
-              <w:t>Anthropic API (500 usuários × R$0,50)</w:t>
+              <w:t>Anthropic (500 × R$0,50)</w:t>
             </w:r>
           </w:p>
         </w:tc>
@@ -1634,7 +1806,7 @@
           </w:tcPr>
           <w:p>
             <w:r>
-              <w:t>Stripe fees (500 × R$1,08)</w:t>
+              <w:t>Stripe fees (500 × R$1,43)</w:t>
             </w:r>
           </w:p>
         </w:tc>
@@ -1644,7 +1816,7 @@
           </w:tcPr>
           <w:p>
             <w:r>
-              <w:t>~R$540</w:t>
+              <w:t>~R$715</w:t>
             </w:r>
           </w:p>
         </w:tc>
@@ -1678,7 +1850,7 @@
           </w:tcPr>
           <w:p>
             <w:r>
-              <w:t>TOTAL</w:t>
+              <w:t>Custo total</w:t>
             </w:r>
           </w:p>
         </w:tc>
@@ -1688,7 +1860,7 @@
           </w:tcPr>
           <w:p>
             <w:r>
-              <w:t>~R$793/mês</w:t>
+              <w:t>~R$1.093,50</w:t>
             </w:r>
           </w:p>
         </w:tc>
@@ -1700,7 +1872,7 @@
           </w:tcPr>
           <w:p>
             <w:r>
-              <w:t>Receita bruta (500 × R$19,90)</w:t>
+              <w:t>Receita bruta (500 × R$29,90)</w:t>
             </w:r>
           </w:p>
         </w:tc>
@@ -1710,7 +1882,7 @@
           </w:tcPr>
           <w:p>
             <w:r>
-              <w:t>R$9.950/mês</w:t>
+              <w:t>R$14.950</w:t>
             </w:r>
           </w:p>
         </w:tc>
@@ -1732,7 +1904,7 @@
           </w:tcPr>
           <w:p>
             <w:r>
-              <w:t>~R$9.157/mês (~92%)</w:t>
+              <w:t>~R$13.856 (~93%)</w:t>
             </w:r>
           </w:p>
         </w:tc>
@@ -1773,7 +1945,7 @@
                 <w:b/>
                 <w:color w:val="FFFFFF"/>
               </w:rPr>
-              <w:t>Serviço</w:t>
+              <w:t>Item</w:t>
             </w:r>
           </w:p>
         </w:tc>
@@ -1800,7 +1972,7 @@
           </w:tcPr>
           <w:p>
             <w:r>
-              <w:t>Vercel Pro (analytics, maior CDN)</w:t>
+              <w:t>Vercel Pro (analytics + CDN melhorado)</w:t>
             </w:r>
           </w:p>
         </w:tc>
@@ -1822,7 +1994,7 @@
           </w:tcPr>
           <w:p>
             <w:r>
-              <w:t>Supabase Pro ($25)</w:t>
+              <w:t>Supabase Pro</w:t>
             </w:r>
           </w:p>
         </w:tc>
@@ -1832,7 +2004,7 @@
           </w:tcPr>
           <w:p>
             <w:r>
-              <w:t>~R$125</w:t>
+              <w:t>R$125</w:t>
             </w:r>
           </w:p>
         </w:tc>
@@ -1844,7 +2016,7 @@
           </w:tcPr>
           <w:p>
             <w:r>
-              <w:t>Anthropic API (2000 usuários × R$0,50)</w:t>
+              <w:t>Anthropic (2000 × R$0,50)</w:t>
             </w:r>
           </w:p>
         </w:tc>
@@ -1866,7 +2038,7 @@
           </w:tcPr>
           <w:p>
             <w:r>
-              <w:t>Stripe fees (2000 × R$1,08)</w:t>
+              <w:t>Stripe fees (2000 × R$1,43)</w:t>
             </w:r>
           </w:p>
         </w:tc>
@@ -1876,7 +2048,7 @@
           </w:tcPr>
           <w:p>
             <w:r>
-              <w:t>~R$2.160</w:t>
+              <w:t>~R$2.860</w:t>
             </w:r>
           </w:p>
         </w:tc>
@@ -1888,7 +2060,7 @@
           </w:tcPr>
           <w:p>
             <w:r>
-              <w:t>TOTAL</w:t>
+              <w:t>Custo total</w:t>
             </w:r>
           </w:p>
         </w:tc>
@@ -1898,7 +2070,7 @@
           </w:tcPr>
           <w:p>
             <w:r>
-              <w:t>~R$3.385/mês</w:t>
+              <w:t>~R$4.085</w:t>
             </w:r>
           </w:p>
         </w:tc>
@@ -1910,7 +2082,7 @@
           </w:tcPr>
           <w:p>
             <w:r>
-              <w:t>Receita bruta</w:t>
+              <w:t>Receita bruta (2000 × R$29,90)</w:t>
             </w:r>
           </w:p>
         </w:tc>
@@ -1920,7 +2092,7 @@
           </w:tcPr>
           <w:p>
             <w:r>
-              <w:t>R$39.800/mês</w:t>
+              <w:t>R$59.800</w:t>
             </w:r>
           </w:p>
         </w:tc>
@@ -1942,7 +2114,7 @@
           </w:tcPr>
           <w:p>
             <w:r>
-              <w:t>~R$36.415/mês (~91%)</w:t>
+              <w:t>~R$55.715 (~93%)</w:t>
             </w:r>
           </w:p>
         </w:tc>
@@ -1977,7 +2149,7 @@
           <w:color w:val="2E6D8E"/>
           <w:sz w:val="24"/>
         </w:rPr>
-        <w:t>Obrigatório antes de abrir para usuários pagantes</w:t>
+        <w:t>Antes de aceitar pagamentos reais</w:t>
       </w:r>
     </w:p>
     <w:p>
@@ -1993,7 +2165,7 @@
         <w:pStyle w:val="ListBullet"/>
       </w:pPr>
       <w:r>
-        <w:t>☐  Stripe: criar Product + Price (assinatura mensal R$19,90)</w:t>
+        <w:t>☐  Stripe: criar Product + Price (assinatura mensal R$29,90 e anual R$239)</w:t>
       </w:r>
     </w:p>
     <w:p>
@@ -2001,7 +2173,15 @@
         <w:pStyle w:val="ListBullet"/>
       </w:pPr>
       <w:r>
-        <w:t>☐  Supabase: criar Edge Function stripe-webhook (recebe eventos de pagamento)</w:t>
+        <w:t>☐  Supabase: upgrade para plano Pro</w:t>
+      </w:r>
+    </w:p>
+    <w:p>
+      <w:pPr>
+        <w:pStyle w:val="ListBullet"/>
+      </w:pPr>
+      <w:r>
+        <w:t>☐  Supabase: criar Edge Function stripe-webhook (processa eventos de pagamento)</w:t>
       </w:r>
     </w:p>
     <w:p>
@@ -2017,7 +2197,7 @@
         <w:pStyle w:val="ListBullet"/>
       </w:pPr>
       <w:r>
-        <w:t>☐  Supabase: adicionar coluna plano e stripe_customer_id na tabela preferencias</w:t>
+        <w:t>☐  Supabase: adicionar colunas plano_tipo e stripe_customer_id na tabela preferencias</w:t>
       </w:r>
     </w:p>
     <w:p>
@@ -2041,7 +2221,7 @@
         <w:pStyle w:val="ListBullet"/>
       </w:pPr>
       <w:r>
-        <w:t>☐  Supabase: adicionar trigger/RLS para rate limiting de gerações no backend</w:t>
+        <w:t>☐  Supabase: adicionar trigger para rate limiting de gerações no backend</w:t>
       </w:r>
     </w:p>
     <w:p>
@@ -2049,7 +2229,7 @@
         <w:pStyle w:val="ListBullet"/>
       </w:pPr>
       <w:r>
-        <w:t>☐  GitHub: adicionar variáveis de ambiente no repositório (STRIPE_SECRET_KEY, ANTHROPIC_KEY)</w:t>
+        <w:t>☐  Supabase: configurar secrets (STRIPE_SECRET, ANTHROPIC_KEY, STRIPE_WEBHOOK_SECRET)</w:t>
       </w:r>
     </w:p>
     <w:p>
@@ -2057,15 +2237,7 @@
         <w:pStyle w:val="ListBullet"/>
       </w:pPr>
       <w:r>
-        <w:t>☐  Supabase: configurar secrets para Edge Functions (STRIPE_SECRET, ANTHROPIC_KEY, STRIPE_WEBHOOK_SECRET)</w:t>
-      </w:r>
-    </w:p>
-    <w:p>
-      <w:pPr>
-        <w:pStyle w:val="ListBullet"/>
-      </w:pPr>
-      <w:r>
-        <w:t>☐  Domínio: apontar CNAME para felipealima1984.github.io</w:t>
+        <w:t>☐  Domínio: registrar estudaai.com.br e apontar CNAME para felipealima1984.github.io</w:t>
       </w:r>
     </w:p>
     <w:p>
@@ -2081,7 +2253,7 @@
         <w:pStyle w:val="ListBullet"/>
       </w:pPr>
       <w:r>
-        <w:t>☐  Stripe: configurar webhook URL para https://[seu-projeto].supabase.co/functions/v1/stripe-webhook</w:t>
+        <w:t>☐  Stripe: configurar webhook URL para https://[projeto].supabase.co/functions/v1/stripe-webhook</w:t>
       </w:r>
     </w:p>
     <w:p>
@@ -2089,7 +2261,7 @@
         <w:pStyle w:val="ListBullet"/>
       </w:pPr>
       <w:r>
-        <w:t>☐  Testar fluxo completo: cadastro → paywall → checkout → webhook → premium ativo → geração via proxy</w:t>
+        <w:t>☐  Testar fluxo completo: cadastro → paywall → checkout Stripe → webhook → premium ativo → geração via proxy</w:t>
       </w:r>
     </w:p>
     <w:p>
@@ -2109,7 +2281,7 @@
         <w:pStyle w:val="ListBullet"/>
       </w:pPr>
       <w:r>
-        <w:t>☐  Nunca expor STRIPE_SECRET_KEY no frontend (apenas STRIPE_PUBLISHABLE_KEY)</w:t>
+        <w:t>☐  Nunca expor STRIPE_SECRET_KEY no frontend (só STRIPE_PUBLISHABLE_KEY)</w:t>
       </w:r>
     </w:p>
     <w:p>
@@ -2149,7 +2321,7 @@
         <w:pStyle w:val="ListBullet"/>
       </w:pPr>
       <w:r>
-        <w:t>☐  Validar plano premium no backend antes de processar geração (não só no frontend)</w:t>
+        <w:t>☐  Validar plano premium no backend antes de processar geração</w:t>
       </w:r>
     </w:p>
     <w:p>
@@ -2168,7 +2340,7 @@
           <w:color w:val="1A5676"/>
           <w:sz w:val="28"/>
         </w:rPr>
-        <w:t>Documentos de referência</w:t>
+        <w:t>Referências</w:t>
       </w:r>
     </w:p>
     <w:p>
@@ -2176,7 +2348,7 @@
         <w:pStyle w:val="ListBullet"/>
       </w:pPr>
       <w:r>
-        <w:t>Supabase Edge Functions Quickstart</w:t>
+        <w:t>Supabase Edge Functions</w:t>
       </w:r>
     </w:p>
     <w:p>
@@ -2184,7 +2356,7 @@
         <w:pStyle w:val="ListBullet"/>
       </w:pPr>
       <w:r>
-        <w:t>Stripe Checkout — documentação</w:t>
+        <w:t>Stripe Checkout</w:t>
       </w:r>
     </w:p>
     <w:p>
@@ -2192,7 +2364,7 @@
         <w:pStyle w:val="ListBullet"/>
       </w:pPr>
       <w:r>
-        <w:t>Stripe Webhooks — como configurar</w:t>
+        <w:t>Stripe Webhooks</w:t>
       </w:r>
     </w:p>
     <w:p>
@@ -2216,7 +2388,7 @@
         <w:pStyle w:val="ListBullet"/>
       </w:pPr>
       <w:r>
-        <w:t>Registro.br — domínios .br</w:t>
+        <w:t>Registro.br</w:t>
       </w:r>
     </w:p>
     <w:sectPr>

</xml_diff>

<commit_message>
refactor: rebrand Estuda.AI → Mestriai
- Todos os textos, títulos e referências de produto renomeados
- localStorage: prefixo estuda_ → mestriai_ em todos os arquivos
- Cache Service Worker: estudaai-v1.10.0 → mestriai-v1.10.0
- manifest.json: name e short_name atualizados
- Logos removidas temporariamente (img → span.logo-text);
  atualizarLogoTema() mantida como stub aguardando novos assets
- auth-sub generalizado: "CACD & Direito" → "Estude qualquer matéria"
- Título da página e apple-mobile-web-app-title atualizados
- docs/deploy-producao.md e .docx: domínios e projeções com novo nome
- README, ROADMAP, CLAUDE.md, SUPABASE-SETUP.md atualizados

Co-Authored-By: Claude Sonnet 4.6 <noreply@anthropic.com>
</commit_message>
<xml_diff>
--- a/docs/deploy-producao.docx
+++ b/docs/deploy-producao.docx
@@ -11,7 +11,7 @@
           <w:color w:val="1A5676"/>
           <w:sz w:val="36"/>
         </w:rPr>
-        <w:t>Estuda.AI — Guia de Deploy em Produção</w:t>
+        <w:t>Mestriai — Guia de Deploy em Produção</w:t>
       </w:r>
     </w:p>
     <w:p>
@@ -59,7 +59,7 @@
     </w:p>
     <w:p>
       <w:r>
-        <w:t xml:space="preserve">O Estuda.AI é uma SPA single-file (index.html). O frontend </w:t>
+        <w:t xml:space="preserve">O Mestriai é uma SPA single-file (index.html). O frontend </w:t>
       </w:r>
       <w:r>
         <w:rPr>
@@ -955,7 +955,7 @@
           </w:tcPr>
           <w:p>
             <w:r>
-              <w:t>estudaai.com.br</w:t>
+              <w:t>mestriai.com.br</w:t>
             </w:r>
           </w:p>
         </w:tc>
@@ -987,7 +987,7 @@
           </w:tcPr>
           <w:p>
             <w:r>
-              <w:t>estudaai.com</w:t>
+              <w:t>mestriai.com</w:t>
             </w:r>
           </w:p>
         </w:tc>
@@ -1019,7 +1019,7 @@
           </w:tcPr>
           <w:p>
             <w:r>
-              <w:t>estuda.ai</w:t>
+              <w:t>mestriai.ai</w:t>
             </w:r>
           </w:p>
         </w:tc>
@@ -1062,7 +1062,7 @@
           <w:rFonts w:ascii="Courier New" w:hAnsi="Courier New"/>
           <w:sz w:val="20"/>
         </w:rPr>
-        <w:t>estudaai.com.br</w:t>
+        <w:t>mestriai.com.br</w:t>
       </w:r>
       <w:r>
         <w:t xml:space="preserve"> no Registro.br. Mais barato, .br passa mais confiança para o público brasileiro.</w:t>
@@ -1269,7 +1269,7 @@
           <w:color w:val="1A5676"/>
           <w:sz w:val="28"/>
         </w:rPr>
-        <w:t>Planos do Estuda.AI</w:t>
+        <w:t>Planos do Mestriai</w:t>
       </w:r>
     </w:p>
     <w:tbl>
@@ -2237,7 +2237,7 @@
         <w:pStyle w:val="ListBullet"/>
       </w:pPr>
       <w:r>
-        <w:t>☐  Domínio: registrar estudaai.com.br e apontar CNAME para felipealima1984.github.io</w:t>
+        <w:t>☐  Domínio: registrar mestriai.com.br e apontar CNAME para felipealima1984.github.io</w:t>
       </w:r>
     </w:p>
     <w:p>

</xml_diff>